<commit_message>
Restore rotation assignments during schedule recalculation
</commit_message>
<xml_diff>
--- a/output/docx/Huong-dan-su-dung-he-thong-lich-truc.docx
+++ b/output/docx/Huong-dan-su-dung-he-thong-lich-truc.docx
@@ -401,6 +401,98 @@
     </w:p>
     <w:p>
       <w:r>
+        <w:t xml:space="preserve">Để sử dụng thành app ngoài màn hình điện thoại đễ theo dõi bạn chỉ cần bấm nút </w:t>
+      </w:r>
+      <w:r>
+        <w:drawing>
+          <wp:inline distT="0" distB="0" distL="0" distR="0" wp14:anchorId="2E92B64E" wp14:editId="211E8303">
+            <wp:extent cx="168908" cy="200187"/>
+            <wp:effectExtent l="0" t="0" r="3175" b="0"/>
+            <wp:docPr id="941079991" name="Picture 1"/>
+            <wp:cNvGraphicFramePr>
+              <a:graphicFrameLocks xmlns:a="http://schemas.openxmlformats.org/drawingml/2006/main" noChangeAspect="1"/>
+            </wp:cNvGraphicFramePr>
+            <a:graphic xmlns:a="http://schemas.openxmlformats.org/drawingml/2006/main">
+              <a:graphicData uri="http://schemas.openxmlformats.org/drawingml/2006/picture">
+                <pic:pic xmlns:pic="http://schemas.openxmlformats.org/drawingml/2006/picture">
+                  <pic:nvPicPr>
+                    <pic:cNvPr id="941079991" name=""/>
+                    <pic:cNvPicPr/>
+                  </pic:nvPicPr>
+                  <pic:blipFill>
+                    <a:blip r:embed="rId11"/>
+                    <a:stretch>
+                      <a:fillRect/>
+                    </a:stretch>
+                  </pic:blipFill>
+                  <pic:spPr>
+                    <a:xfrm>
+                      <a:off x="0" y="0"/>
+                      <a:ext cx="172696" cy="204677"/>
+                    </a:xfrm>
+                    <a:prstGeom prst="rect">
+                      <a:avLst/>
+                    </a:prstGeom>
+                  </pic:spPr>
+                </pic:pic>
+              </a:graphicData>
+            </a:graphic>
+          </wp:inline>
+        </w:drawing>
+      </w:r>
+      <w:r>
+        <w:t xml:space="preserve"> chọn </w:t>
+      </w:r>
+      <w:r>
+        <w:rPr>
+          <w:b/>
+          <w:bCs/>
+        </w:rPr>
+        <w:t>Add to home screen</w:t>
+      </w:r>
+    </w:p>
+    <w:p>
+      <w:pPr>
+        <w:jc w:val="center"/>
+      </w:pPr>
+      <w:r>
+        <w:drawing>
+          <wp:inline distT="0" distB="0" distL="0" distR="0" wp14:anchorId="157D0C73" wp14:editId="47DA194D">
+            <wp:extent cx="1708369" cy="3756752"/>
+            <wp:effectExtent l="0" t="0" r="6350" b="0"/>
+            <wp:docPr id="1700234839" name="Picture 1"/>
+            <wp:cNvGraphicFramePr>
+              <a:graphicFrameLocks xmlns:a="http://schemas.openxmlformats.org/drawingml/2006/main" noChangeAspect="1"/>
+            </wp:cNvGraphicFramePr>
+            <a:graphic xmlns:a="http://schemas.openxmlformats.org/drawingml/2006/main">
+              <a:graphicData uri="http://schemas.openxmlformats.org/drawingml/2006/picture">
+                <pic:pic xmlns:pic="http://schemas.openxmlformats.org/drawingml/2006/picture">
+                  <pic:nvPicPr>
+                    <pic:cNvPr id="1700234839" name=""/>
+                    <pic:cNvPicPr/>
+                  </pic:nvPicPr>
+                  <pic:blipFill>
+                    <a:blip r:embed="rId12"/>
+                    <a:stretch>
+                      <a:fillRect/>
+                    </a:stretch>
+                  </pic:blipFill>
+                  <pic:spPr>
+                    <a:xfrm>
+                      <a:off x="0" y="0"/>
+                      <a:ext cx="1719656" cy="3781573"/>
+                    </a:xfrm>
+                    <a:prstGeom prst="rect">
+                      <a:avLst/>
+                    </a:prstGeom>
+                  </pic:spPr>
+                </pic:pic>
+              </a:graphicData>
+            </a:graphic>
+          </wp:inline>
+        </w:drawing>
+      </w:r>
+      <w:r>
         <w:br w:type="page"/>
       </w:r>
     </w:p>
@@ -597,7 +689,7 @@
                     <pic:cNvPicPr/>
                   </pic:nvPicPr>
                   <pic:blipFill>
-                    <a:blip r:embed="rId11"/>
+                    <a:blip r:embed="rId13"/>
                     <a:stretch>
                       <a:fillRect/>
                     </a:stretch>
@@ -783,7 +875,7 @@
                     <pic:cNvPicPr/>
                   </pic:nvPicPr>
                   <pic:blipFill>
-                    <a:blip r:embed="rId12"/>
+                    <a:blip r:embed="rId14"/>
                     <a:stretch>
                       <a:fillRect/>
                     </a:stretch>
@@ -850,7 +942,7 @@
                     <pic:cNvPicPr/>
                   </pic:nvPicPr>
                   <pic:blipFill>
-                    <a:blip r:embed="rId13"/>
+                    <a:blip r:embed="rId15"/>
                     <a:stretch>
                       <a:fillRect/>
                     </a:stretch>
@@ -939,7 +1031,7 @@
                     <pic:cNvPicPr/>
                   </pic:nvPicPr>
                   <pic:blipFill>
-                    <a:blip r:embed="rId14"/>
+                    <a:blip r:embed="rId16"/>
                     <a:stretch>
                       <a:fillRect/>
                     </a:stretch>
@@ -1107,7 +1199,7 @@
                     <pic:cNvPicPr/>
                   </pic:nvPicPr>
                   <pic:blipFill>
-                    <a:blip r:embed="rId15"/>
+                    <a:blip r:embed="rId17"/>
                     <a:stretch>
                       <a:fillRect/>
                     </a:stretch>
@@ -1321,7 +1413,7 @@
                     <pic:cNvPicPr/>
                   </pic:nvPicPr>
                   <pic:blipFill>
-                    <a:blip r:embed="rId16"/>
+                    <a:blip r:embed="rId18"/>
                     <a:stretch>
                       <a:fillRect/>
                     </a:stretch>
@@ -1555,7 +1647,7 @@
                     <pic:cNvPicPr/>
                   </pic:nvPicPr>
                   <pic:blipFill>
-                    <a:blip r:embed="rId17"/>
+                    <a:blip r:embed="rId19"/>
                     <a:stretch>
                       <a:fillRect/>
                     </a:stretch>
@@ -1847,8 +1939,8 @@
       </w:pPr>
     </w:p>
     <w:sectPr>
-      <w:headerReference w:type="default" r:id="rId18"/>
-      <w:footerReference w:type="default" r:id="rId19"/>
+      <w:headerReference w:type="default" r:id="rId20"/>
+      <w:footerReference w:type="default" r:id="rId21"/>
       <w:pgSz w:w="11906" w:h="16838"/>
       <w:pgMar w:top="1020" w:right="1020" w:bottom="935" w:left="1020" w:header="454" w:footer="454" w:gutter="0"/>
       <w:cols w:space="720"/>

</xml_diff>